<commit_message>
revisions - adding QRcode
</commit_message>
<xml_diff>
--- a/ClimOO material/materials from ClimOO presentations/5th Ontologies4Chem Workshop/bibliography - Ontologies4Chem.docx
+++ b/ClimOO material/materials from ClimOO presentations/5th Ontologies4Chem Workshop/bibliography - Ontologies4Chem.docx
@@ -259,7 +259,6 @@
           <w:rFonts w:ascii="Calibri" w:hAnsi="Calibri" w:cs="Calibri"/>
           <w:sz w:val="22"/>
           <w:szCs w:val="22"/>
-          <w:lang w:val="en-US"/>
         </w:rPr>
       </w:pPr>
       <w:r>
@@ -287,7 +286,6 @@
             <w:rFonts w:ascii="Calibri" w:hAnsi="Calibri" w:cs="Calibri"/>
             <w:sz w:val="22"/>
             <w:szCs w:val="22"/>
-            <w:lang w:val="en-US"/>
           </w:rPr>
           <w:t>https://aaai.org/papers/0005-ss97-06-005-methontology-from-ontological-art-towards-ontological-engineering/</w:t>
         </w:r>
@@ -297,7 +295,6 @@
           <w:rFonts w:ascii="Calibri" w:hAnsi="Calibri" w:cs="Calibri"/>
           <w:sz w:val="22"/>
           <w:szCs w:val="22"/>
-          <w:lang w:val="en-US"/>
         </w:rPr>
         <w:t xml:space="preserve"> </w:t>
       </w:r>
@@ -854,16 +851,7 @@
             <w:sz w:val="22"/>
             <w:szCs w:val="22"/>
           </w:rPr>
-          <w:t>https://doi.org/</w:t>
-        </w:r>
-        <w:r>
-          <w:rPr>
-            <w:rStyle w:val="Collegamentoipertestuale"/>
-            <w:rFonts w:ascii="Calibri" w:hAnsi="Calibri" w:cs="Calibri"/>
-            <w:sz w:val="22"/>
-            <w:szCs w:val="22"/>
-          </w:rPr>
-          <w:t>10.1109/5254.912382</w:t>
+          <w:t>https://doi.org/10.1109/5254.912382</w:t>
         </w:r>
       </w:hyperlink>
       <w:r>
@@ -1106,6 +1094,80 @@
           <w:lang w:val="en-US"/>
         </w:rPr>
         <w:t xml:space="preserve"> </w:t>
+      </w:r>
+    </w:p>
+    <w:p>
+      <w:pPr>
+        <w:spacing w:line="360" w:lineRule="auto"/>
+        <w:jc w:val="both"/>
+        <w:rPr>
+          <w:rFonts w:ascii="Calibri" w:hAnsi="Calibri" w:cs="Calibri"/>
+          <w:sz w:val="22"/>
+          <w:szCs w:val="22"/>
+          <w:lang w:val="en-US"/>
+        </w:rPr>
+      </w:pPr>
+    </w:p>
+    <w:p>
+      <w:pPr>
+        <w:spacing w:line="360" w:lineRule="auto"/>
+        <w:jc w:val="both"/>
+        <w:rPr>
+          <w:rFonts w:ascii="Calibri" w:hAnsi="Calibri" w:cs="Calibri"/>
+          <w:sz w:val="22"/>
+          <w:szCs w:val="22"/>
+          <w:lang w:val="en-US"/>
+        </w:rPr>
+      </w:pPr>
+      <w:r>
+        <w:rPr>
+          <w:rFonts w:ascii="Calibri" w:hAnsi="Calibri" w:cs="Calibri"/>
+          <w:noProof/>
+          <w:sz w:val="22"/>
+          <w:szCs w:val="22"/>
+          <w:lang w:val="en-US"/>
+        </w:rPr>
+        <w:drawing>
+          <wp:inline distT="0" distB="0" distL="0" distR="0" wp14:anchorId="7286EB5A" wp14:editId="434C02AA">
+            <wp:extent cx="1828800" cy="1828800"/>
+            <wp:effectExtent l="0" t="0" r="0" b="0"/>
+            <wp:docPr id="2063384902" name="Immagine 1" descr="Immagine che contiene modello, quadrato, pixel, design&#10;&#10;Descrizione generata automaticamente"/>
+            <wp:cNvGraphicFramePr>
+              <a:graphicFrameLocks xmlns:a="http://schemas.openxmlformats.org/drawingml/2006/main" noChangeAspect="1"/>
+            </wp:cNvGraphicFramePr>
+            <a:graphic xmlns:a="http://schemas.openxmlformats.org/drawingml/2006/main">
+              <a:graphicData uri="http://schemas.openxmlformats.org/drawingml/2006/picture">
+                <pic:pic xmlns:pic="http://schemas.openxmlformats.org/drawingml/2006/picture">
+                  <pic:nvPicPr>
+                    <pic:cNvPr id="2063384902" name="Immagine 1" descr="Immagine che contiene modello, quadrato, pixel, design&#10;&#10;Descrizione generata automaticamente"/>
+                    <pic:cNvPicPr/>
+                  </pic:nvPicPr>
+                  <pic:blipFill>
+                    <a:blip r:embed="rId25" cstate="print">
+                      <a:extLst>
+                        <a:ext uri="{28A0092B-C50C-407E-A947-70E740481C1C}">
+                          <a14:useLocalDpi xmlns:a14="http://schemas.microsoft.com/office/drawing/2010/main" val="0"/>
+                        </a:ext>
+                      </a:extLst>
+                    </a:blip>
+                    <a:stretch>
+                      <a:fillRect/>
+                    </a:stretch>
+                  </pic:blipFill>
+                  <pic:spPr>
+                    <a:xfrm>
+                      <a:off x="0" y="0"/>
+                      <a:ext cx="1841043" cy="1841043"/>
+                    </a:xfrm>
+                    <a:prstGeom prst="rect">
+                      <a:avLst/>
+                    </a:prstGeom>
+                  </pic:spPr>
+                </pic:pic>
+              </a:graphicData>
+            </a:graphic>
+          </wp:inline>
+        </w:drawing>
       </w:r>
     </w:p>
     <w:sectPr>
@@ -1869,6 +1931,7 @@
   <w:style w:type="character" w:default="1" w:styleId="Carpredefinitoparagrafo">
     <w:name w:val="Default Paragraph Font"/>
     <w:uiPriority w:val="1"/>
+    <w:semiHidden/>
     <w:unhideWhenUsed/>
   </w:style>
   <w:style w:type="table" w:default="1" w:styleId="Tabellanormale">

</xml_diff>